<commit_message>
docs(prd): regenerar PRD en Word (ES + EN) alineados al .md
Actualiza create_prd.py / create_prd_es.py y regenera PRD_Eliseo.docx y
PRD_Eliseo_ES.docx con: estado de implementacion (MoSCoW + criterios),
notas de personas y desajuste front/BD, brecha del link saliente de Ofertas,
pregunta abierta de reconciliacion de esquema, y la nueva seccion 10
(Sistema Visual) con tabla de inventario de pantallas.

Co-Authored-By: Claude Opus 4.8 (1M context) <noreply@anthropic.com>
</commit_message>
<xml_diff>
--- a/PRD_Eliseo.docx
+++ b/PRD_Eliseo.docx
@@ -13,6 +13,14 @@
     </w:p>
     <w:p>
       <w:pPr>
+        <w:jc w:val="center"/>
+      </w:pPr>
+      <w:r>
+        <w:t>Document status: aligned with code on feat/ui-polish (June 2026). Legend: ✅ Done · 🟡 Partial · 🔲 Pending.</w:t>
+      </w:r>
+    </w:p>
+    <w:p>
+      <w:pPr>
         <w:pStyle w:val="Heading1"/>
       </w:pPr>
       <w:r>
@@ -96,7 +104,7 @@
         <w:pStyle w:val="ListNumber2"/>
       </w:pPr>
       <w:r>
-        <w:t>User authentication (Sign up / Login).</w:t>
+        <w:t>✅ User authentication (Sign up / Login).</w:t>
       </w:r>
     </w:p>
     <w:p>
@@ -104,7 +112,7 @@
         <w:pStyle w:val="ListNumber2"/>
       </w:pPr>
       <w:r>
-        <w:t>Manual mechanism to add a card without storing sensitive data (Bin/Bank selection only, plus optional nickname and last 4 digits).</w:t>
+        <w:t>✅ Manual mechanism to add a card without storing sensitive data (Bank/model selection only, plus optional nickname and last 4 digits).</w:t>
       </w:r>
     </w:p>
     <w:p>
@@ -112,7 +120,7 @@
         <w:pStyle w:val="ListNumber2"/>
       </w:pPr>
       <w:r>
-        <w:t>Dashboard showing primary card and summary metrics.</w:t>
+        <w:t>✅ Dashboard showing primary card and summary metrics.</w:t>
       </w:r>
     </w:p>
     <w:p>
@@ -120,7 +128,7 @@
         <w:pStyle w:val="ListNumber2"/>
       </w:pPr>
       <w:r>
-        <w:t>Category-based Recommender engine (matching user's added cards against hardcoded benefits DB).</w:t>
+        <w:t>✅ Category-based Recommender engine (matching user's added cards against the benefits DB).</w:t>
       </w:r>
     </w:p>
     <w:p>
@@ -128,7 +136,7 @@
         <w:pStyle w:val="ListNumber2"/>
       </w:pPr>
       <w:r>
-        <w:t>Card Detail view showing categorized benefits.</w:t>
+        <w:t>✅ Card Detail view showing categorized benefits.</w:t>
       </w:r>
     </w:p>
     <w:p>
@@ -144,7 +152,7 @@
         <w:pStyle w:val="ListNumber2"/>
       </w:pPr>
       <w:r>
-        <w:t>Dynamic Offers feed with expiration dates.</w:t>
+        <w:t>✅ Dynamic Offers feed with expiration dates.</w:t>
       </w:r>
     </w:p>
     <w:p>
@@ -152,7 +160,7 @@
         <w:pStyle w:val="ListNumber2"/>
       </w:pPr>
       <w:r>
-        <w:t>Filtering of Offers by Bank and Category.</w:t>
+        <w:t>✅ Filtering of Offers by Bank and Category.</w:t>
       </w:r>
     </w:p>
     <w:p>
@@ -160,7 +168,7 @@
         <w:pStyle w:val="ListNumber2"/>
       </w:pPr>
       <w:r>
-        <w:t>Highlighting of "Best in Market" cards (Destacados) to drive affiliate conversions.</w:t>
+        <w:t>🔲 Highlighting of "Best in Market" cards (Destacados) to drive affiliate conversions. (No screen or route yet.)</w:t>
       </w:r>
     </w:p>
     <w:p>
@@ -176,7 +184,7 @@
         <w:pStyle w:val="ListNumber2"/>
       </w:pPr>
       <w:r>
-        <w:t>Push notifications for expiring offers.</w:t>
+        <w:t>🔲 Push notifications for expiring offers. (Existed in previous main; not in current refactor.)</w:t>
       </w:r>
     </w:p>
     <w:p>
@@ -184,7 +192,7 @@
         <w:pStyle w:val="ListNumber2"/>
       </w:pPr>
       <w:r>
-        <w:t>Geolocated benefits (e.g., "You are near an airport, here are your Lounge benefits").</w:t>
+        <w:t>🔲 Geolocated benefits (e.g., "You are near an airport, here are your Lounge benefits"). (Same.)</w:t>
       </w:r>
     </w:p>
     <w:p>
@@ -224,7 +232,15 @@
         <w:pStyle w:val="ListBullet"/>
       </w:pPr>
       <w:r>
-        <w:t>Primary Persona: Andrés (32), Tech-savvy Millennial. Works in tech/marketing. Has 4 cards (Nu, Bancolombia LifeMiles, RappiCard, Falabella). Travels 3 times a year. Wants to get free flights but forgets which card gives lounge access or the best miles multiplier.</w:t>
+        <w:t>Note: detailed, current personas live in .product/PERSONAS/ (Gloria Espinosa, Sandra Moreno, Sebastián Ríos). The "Andrés" archetype below is kept as a summary of the primary JTBD.</w:t>
+      </w:r>
+    </w:p>
+    <w:p>
+      <w:pPr>
+        <w:pStyle w:val="ListBullet"/>
+      </w:pPr>
+      <w:r>
+        <w:t>Primary archetype (JTBD): Andrés (32), Tech-savvy Millennial. Works in tech/marketing. Has 4 cards (Nu, Bancolombia LifeMiles, RappiCard, Falabella). Travels 3 times a year. Wants to get free flights but forgets which card gives lounge access or the best miles multiplier.</w:t>
       </w:r>
     </w:p>
     <w:p>
@@ -288,7 +304,7 @@
         <w:pStyle w:val="ListNumber2"/>
       </w:pPr>
       <w:r>
-        <w:t>[ ] System displays a searchable list of banks (traditional and digital).</w:t>
+        <w:t>[x] System displays a searchable list of banks (traditional and digital).</w:t>
       </w:r>
     </w:p>
     <w:p>
@@ -296,7 +312,7 @@
         <w:pStyle w:val="ListNumber2"/>
       </w:pPr>
       <w:r>
-        <w:t>[ ] System filters card models immediately after bank selection.</w:t>
+        <w:t>[x] System filters card models immediately after bank selection.</w:t>
       </w:r>
     </w:p>
     <w:p>
@@ -304,7 +320,7 @@
         <w:pStyle w:val="ListNumber2"/>
       </w:pPr>
       <w:r>
-        <w:t>[ ] User can optionally enter a string (max 40 chars) for Nickname, and numeric (max 4 chars) for "Last 4 digits".</w:t>
+        <w:t>[x] User can optionally enter a string (max 40 chars) for Nickname, and numeric (max 4 chars) for "Last 4 digits".</w:t>
       </w:r>
     </w:p>
     <w:p>
@@ -312,7 +328,7 @@
         <w:pStyle w:val="ListNumber2"/>
       </w:pPr>
       <w:r>
-        <w:t>[ ] System saves the mapping (user_id, card_id, nickname, last_four) to the database.</w:t>
+        <w:t>[x] System saves the mapping (user_id, card_id, nickname, last_four) to the database.</w:t>
       </w:r>
     </w:p>
     <w:p>
@@ -344,7 +360,7 @@
         <w:pStyle w:val="ListNumber2"/>
       </w:pPr>
       <w:r>
-        <w:t>[ ] System retrieves all cards linked to the active user.</w:t>
+        <w:t>[x] System retrieves all cards linked to the active user.</w:t>
       </w:r>
     </w:p>
     <w:p>
@@ -352,7 +368,7 @@
         <w:pStyle w:val="ListNumber2"/>
       </w:pPr>
       <w:r>
-        <w:t>[ ] System fetches benefits for those cards matching the selected category_id.</w:t>
+        <w:t>[x] System fetches benefits for those cards matching the selected category_id.</w:t>
       </w:r>
     </w:p>
     <w:p>
@@ -360,7 +376,7 @@
         <w:pStyle w:val="ListNumber2"/>
       </w:pPr>
       <w:r>
-        <w:t>[ ] System sorts cards based on a weighting algorithm (e.g., 5% cashback &gt; 3% cashback &gt; x2 points).</w:t>
+        <w:t>[x] System sorts cards based on a weighting algorithm. (Implemented in Recommender.tsx via VALUE_TYPE_WEIGHT × numeric_value; see open question 9.1.)</w:t>
       </w:r>
     </w:p>
     <w:p>
@@ -368,7 +384,7 @@
         <w:pStyle w:val="ListNumber2"/>
       </w:pPr>
       <w:r>
-        <w:t>[ ] Results load in &lt; 500ms.</w:t>
+        <w:t>[x] Results load in &lt; 500ms.</w:t>
       </w:r>
     </w:p>
     <w:p>
@@ -376,7 +392,7 @@
         <w:pStyle w:val="ListNumber2"/>
       </w:pPr>
       <w:r>
-        <w:t>[ ] If no card has specific benefits for the category, system displays a fallback message teaching the user to use their base baseline card.</w:t>
+        <w:t>[x] If no card has specific benefits for the category, system displays a fallback message teaching the user to use their baseline card.</w:t>
       </w:r>
     </w:p>
     <w:p>
@@ -408,7 +424,7 @@
         <w:pStyle w:val="ListNumber2"/>
       </w:pPr>
       <w:r>
-        <w:t>[ ] System queries the Offers table for active promotions (valid_until &gt;= today OR valid_until is NULL).</w:t>
+        <w:t>[x] System queries the Offers table for active promotions (valid_until &gt;= today OR valid_until is NULL).</w:t>
       </w:r>
     </w:p>
     <w:p>
@@ -416,7 +432,7 @@
         <w:pStyle w:val="ListNumber2"/>
       </w:pPr>
       <w:r>
-        <w:t>[ ] User can toggle one or multiple bank chips to filter.</w:t>
+        <w:t>[x] User can toggle one or multiple bank chips to filter.</w:t>
       </w:r>
     </w:p>
     <w:p>
@@ -424,7 +440,7 @@
         <w:pStyle w:val="ListNumber2"/>
       </w:pPr>
       <w:r>
-        <w:t>[ ] User can toggle category chips to filter.</w:t>
+        <w:t>[x] User can toggle category chips to filter.</w:t>
       </w:r>
     </w:p>
     <w:p>
@@ -432,7 +448,7 @@
         <w:pStyle w:val="ListNumber2"/>
       </w:pPr>
       <w:r>
-        <w:t>[ ] Clicking an offer opens a detailed view with a direct, trackable outbound link to the bank.</w:t>
+        <w:t>[ ] 🔲 Pending: Clicking an offer opens a detailed view with a direct, trackable outbound link to the bank. (Today offers are not clickable and the Offer type has no URL field. This is the CTA the conversion KPI depends on.)</w:t>
       </w:r>
     </w:p>
     <w:p>
@@ -616,7 +632,15 @@
         <w:pStyle w:val="ListNumber2"/>
       </w:pPr>
       <w:r>
-        <w:t>Offers: id (PK), bank_id (FK), title, description, category, valid_until (timestamp).</w:t>
+        <w:t>Offers: id (PK), bank_id (FK), title, description, category, valid_until (timestamp). (Pending: add url/outbound link for the 4.3 CTA.)</w:t>
+      </w:r>
+    </w:p>
+    <w:p>
+      <w:pPr>
+        <w:pStyle w:val="ListBullet"/>
+      </w:pPr>
+      <w:r>
+        <w:t>⚠️ Front ↔ DB mismatch to reconcile: the front queries English table names (cards_user, cards, banks, benefits), but supabase/schema.sql defines Spanish names (user_cards, bancos, tarjetas, beneficios_*). Until unified, the front against real Supabase returns empty data. The type contract lives in src/types/database.ts. The front can be developed decoupled with mock data (VITE_USE_MOCKS=true).</w:t>
       </w:r>
     </w:p>
     <w:p>
@@ -761,6 +785,561 @@
       </w:pPr>
       <w:r>
         <w:t>2. Data Ingestion: Manual entry of Card Benefits does not scale. What is the process or tool for scraping bank websites to keep the Offers table and Benefits table updated?</w:t>
+      </w:r>
+    </w:p>
+    <w:p>
+      <w:pPr>
+        <w:pStyle w:val="ListNumber"/>
+      </w:pPr>
+      <w:r>
+        <w:t>3. Schema reconciliation: unify table names between front (cards_user/banks/benefits) and DB (user_cards/bancos/beneficios_*) — rename the schema or adjust the front? (In progress.)</w:t>
+      </w:r>
+    </w:p>
+    <w:p>
+      <w:pPr>
+        <w:pStyle w:val="Heading1"/>
+      </w:pPr>
+      <w:r>
+        <w:t>10. Design &amp; UX (Visual System)</w:t>
+      </w:r>
+    </w:p>
+    <w:p>
+      <w:r>
+        <w:t>Section added as a base for the redesign. Reflects the current system in tailwind.config.js + src/index.css.</w:t>
+      </w:r>
+    </w:p>
+    <w:p>
+      <w:pPr>
+        <w:pStyle w:val="Heading2"/>
+      </w:pPr>
+      <w:r>
+        <w:t>10.1 Principles</w:t>
+      </w:r>
+    </w:p>
+    <w:p>
+      <w:pPr>
+        <w:pStyle w:val="ListBullet"/>
+      </w:pPr>
+      <w:r>
+        <w:t>Mobile-first: centered container max-w-2xl, fixed bottom navigation of 5 items (Home, Cards, Recommender, Offers, Profile). Content reserves pb-24 so it is not covered by the nav.</w:t>
+      </w:r>
+    </w:p>
+    <w:p>
+      <w:pPr>
+        <w:pStyle w:val="ListBullet"/>
+      </w:pPr>
+      <w:r>
+        <w:t>Clean and soft: rounded cards (rounded-2xl), subtle violet-tinted shadows, plenty of whitespace, hierarchy via type weight.</w:t>
+      </w:r>
+    </w:p>
+    <w:p>
+      <w:pPr>
+        <w:pStyle w:val="ListBullet"/>
+      </w:pPr>
+      <w:r>
+        <w:t>Alive: entry micro-animations (fade + slide) with Framer Motion; animated nav indicator (layoutId), active:scale-95 on buttons.</w:t>
+      </w:r>
+    </w:p>
+    <w:p>
+      <w:pPr>
+        <w:pStyle w:val="Heading2"/>
+      </w:pPr>
+      <w:r>
+        <w:t>10.2 Color</w:t>
+      </w:r>
+    </w:p>
+    <w:p>
+      <w:pPr>
+        <w:pStyle w:val="ListBullet"/>
+      </w:pPr>
+      <w:r>
+        <w:t>Primary eliseo (violet): 50 #F0EFFE · 100 #E4E1FD · 400 #8577F5 · 500 #5B4CF5 (primary action) · 600 #4A3DE3.</w:t>
+      </w:r>
+    </w:p>
+    <w:p>
+      <w:pPr>
+        <w:pStyle w:val="ListBullet"/>
+      </w:pPr>
+      <w:r>
+        <w:t>Success mint: 50 #EAFBF5 · 500 #10B981.</w:t>
+      </w:r>
+    </w:p>
+    <w:p>
+      <w:pPr>
+        <w:pStyle w:val="ListBullet"/>
+      </w:pPr>
+      <w:r>
+        <w:t>Accent coral 500 #FF6B57 (alerts/highlights).</w:t>
+      </w:r>
+    </w:p>
+    <w:p>
+      <w:pPr>
+        <w:pStyle w:val="ListBullet"/>
+      </w:pPr>
+      <w:r>
+        <w:t>Background #F7F8FF · Surface #FFFFFF · Text #0F0F23.</w:t>
+      </w:r>
+    </w:p>
+    <w:p>
+      <w:pPr>
+        <w:pStyle w:val="ListBullet"/>
+      </w:pPr>
+      <w:r>
+        <w:t>Gradients: gradient-eliseo (brand), and per card tier: gradient-gold, gradient-platinum, gradient-black, etc.</w:t>
+      </w:r>
+    </w:p>
+    <w:p>
+      <w:pPr>
+        <w:pStyle w:val="Heading2"/>
+      </w:pPr>
+      <w:r>
+        <w:t>10.3 Typography</w:t>
+      </w:r>
+    </w:p>
+    <w:p>
+      <w:pPr>
+        <w:pStyle w:val="ListBullet"/>
+      </w:pPr>
+      <w:r>
+        <w:t>Inter font (system-ui fallback). Page titles text-2xl font-bold; sections section-title (text-lg font-bold); body text-sm; metadata text-xs / text-[10-11px].</w:t>
+      </w:r>
+    </w:p>
+    <w:p>
+      <w:pPr>
+        <w:pStyle w:val="Heading2"/>
+      </w:pPr>
+      <w:r>
+        <w:t>10.4 Components (classes in index.css)</w:t>
+      </w:r>
+    </w:p>
+    <w:p>
+      <w:pPr>
+        <w:pStyle w:val="ListBullet"/>
+      </w:pPr>
+      <w:r>
+        <w:t>eliseo-card — white container, rounded-2xl, card shadow, eliseo-100/50 border.</w:t>
+      </w:r>
+    </w:p>
+    <w:p>
+      <w:pPr>
+        <w:pStyle w:val="ListBullet"/>
+      </w:pPr>
+      <w:r>
+        <w:t>eliseo-btn-primary / -secondary / -outline — rounded-xl buttons, active:scale-95.</w:t>
+      </w:r>
+    </w:p>
+    <w:p>
+      <w:pPr>
+        <w:pStyle w:val="ListBullet"/>
+      </w:pPr>
+      <w:r>
+        <w:t>input-field — input with focus:ring-eliseo-300.</w:t>
+      </w:r>
+    </w:p>
+    <w:p>
+      <w:pPr>
+        <w:pStyle w:val="ListBullet"/>
+      </w:pPr>
+      <w:r>
+        <w:t>glass — bottom bar with backdrop-blur. Shadows: card, card-hover, float. Icons: lucide-react.</w:t>
+      </w:r>
+    </w:p>
+    <w:p>
+      <w:pPr>
+        <w:pStyle w:val="Heading2"/>
+      </w:pPr>
+      <w:r>
+        <w:t>10.5 Screen inventory</w:t>
+      </w:r>
+    </w:p>
+    <w:tbl>
+      <w:tblPr>
+        <w:tblStyle w:val="TableGrid"/>
+        <w:tblW w:type="auto" w:w="0"/>
+        <w:tblLook w:firstColumn="1" w:firstRow="1" w:lastColumn="0" w:lastRow="0" w:noHBand="0" w:noVBand="1" w:val="04A0"/>
+      </w:tblPr>
+      <w:tblGrid>
+        <w:gridCol w:w="2880"/>
+        <w:gridCol w:w="2880"/>
+        <w:gridCol w:w="2880"/>
+      </w:tblGrid>
+      <w:tr>
+        <w:tc>
+          <w:tcPr>
+            <w:tcW w:type="dxa" w:w="2880"/>
+          </w:tcPr>
+          <w:p>
+            <w:r>
+              <w:t>Route</w:t>
+            </w:r>
+          </w:p>
+        </w:tc>
+        <w:tc>
+          <w:tcPr>
+            <w:tcW w:type="dxa" w:w="2880"/>
+          </w:tcPr>
+          <w:p>
+            <w:r>
+              <w:t>Screen</w:t>
+            </w:r>
+          </w:p>
+        </w:tc>
+        <w:tc>
+          <w:tcPr>
+            <w:tcW w:type="dxa" w:w="2880"/>
+          </w:tcPr>
+          <w:p>
+            <w:r>
+              <w:t>Status</w:t>
+            </w:r>
+          </w:p>
+        </w:tc>
+      </w:tr>
+      <w:tr>
+        <w:tc>
+          <w:tcPr>
+            <w:tcW w:type="dxa" w:w="2880"/>
+          </w:tcPr>
+          <w:p>
+            <w:r>
+              <w:t>/</w:t>
+            </w:r>
+          </w:p>
+        </w:tc>
+        <w:tc>
+          <w:tcPr>
+            <w:tcW w:type="dxa" w:w="2880"/>
+          </w:tcPr>
+          <w:p>
+            <w:r>
+              <w:t>Landing (hero + features)</w:t>
+            </w:r>
+          </w:p>
+        </w:tc>
+        <w:tc>
+          <w:tcPr>
+            <w:tcW w:type="dxa" w:w="2880"/>
+          </w:tcPr>
+          <w:p>
+            <w:r>
+              <w:t>✅</w:t>
+            </w:r>
+          </w:p>
+        </w:tc>
+      </w:tr>
+      <w:tr>
+        <w:tc>
+          <w:tcPr>
+            <w:tcW w:type="dxa" w:w="2880"/>
+          </w:tcPr>
+          <w:p>
+            <w:r>
+              <w:t>/auth</w:t>
+            </w:r>
+          </w:p>
+        </w:tc>
+        <w:tc>
+          <w:tcPr>
+            <w:tcW w:type="dxa" w:w="2880"/>
+          </w:tcPr>
+          <w:p>
+            <w:r>
+              <w:t>Login / Sign up</w:t>
+            </w:r>
+          </w:p>
+        </w:tc>
+        <w:tc>
+          <w:tcPr>
+            <w:tcW w:type="dxa" w:w="2880"/>
+          </w:tcPr>
+          <w:p>
+            <w:r>
+              <w:t>✅</w:t>
+            </w:r>
+          </w:p>
+        </w:tc>
+      </w:tr>
+      <w:tr>
+        <w:tc>
+          <w:tcPr>
+            <w:tcW w:type="dxa" w:w="2880"/>
+          </w:tcPr>
+          <w:p>
+            <w:r>
+              <w:t>/dashboard</w:t>
+            </w:r>
+          </w:p>
+        </w:tc>
+        <w:tc>
+          <w:tcPr>
+            <w:tcW w:type="dxa" w:w="2880"/>
+          </w:tcPr>
+          <w:p>
+            <w:r>
+              <w:t>Primary card + stats + quick actions + categories</w:t>
+            </w:r>
+          </w:p>
+        </w:tc>
+        <w:tc>
+          <w:tcPr>
+            <w:tcW w:type="dxa" w:w="2880"/>
+          </w:tcPr>
+          <w:p>
+            <w:r>
+              <w:t>✅</w:t>
+            </w:r>
+          </w:p>
+        </w:tc>
+      </w:tr>
+      <w:tr>
+        <w:tc>
+          <w:tcPr>
+            <w:tcW w:type="dxa" w:w="2880"/>
+          </w:tcPr>
+          <w:p>
+            <w:r>
+              <w:t>/my-cards</w:t>
+            </w:r>
+          </w:p>
+        </w:tc>
+        <w:tc>
+          <w:tcPr>
+            <w:tcW w:type="dxa" w:w="2880"/>
+          </w:tcPr>
+          <w:p>
+            <w:r>
+              <w:t>List of wallet cards</w:t>
+            </w:r>
+          </w:p>
+        </w:tc>
+        <w:tc>
+          <w:tcPr>
+            <w:tcW w:type="dxa" w:w="2880"/>
+          </w:tcPr>
+          <w:p>
+            <w:r>
+              <w:t>✅</w:t>
+            </w:r>
+          </w:p>
+        </w:tc>
+      </w:tr>
+      <w:tr>
+        <w:tc>
+          <w:tcPr>
+            <w:tcW w:type="dxa" w:w="2880"/>
+          </w:tcPr>
+          <w:p>
+            <w:r>
+              <w:t>/add-card</w:t>
+            </w:r>
+          </w:p>
+        </w:tc>
+        <w:tc>
+          <w:tcPr>
+            <w:tcW w:type="dxa" w:w="2880"/>
+          </w:tcPr>
+          <w:p>
+            <w:r>
+              <w:t>Add in 3 steps (bank → card → details)</w:t>
+            </w:r>
+          </w:p>
+        </w:tc>
+        <w:tc>
+          <w:tcPr>
+            <w:tcW w:type="dxa" w:w="2880"/>
+          </w:tcPr>
+          <w:p>
+            <w:r>
+              <w:t>✅</w:t>
+            </w:r>
+          </w:p>
+        </w:tc>
+      </w:tr>
+      <w:tr>
+        <w:tc>
+          <w:tcPr>
+            <w:tcW w:type="dxa" w:w="2880"/>
+          </w:tcPr>
+          <w:p>
+            <w:r>
+              <w:t>/card-detail/:id</w:t>
+            </w:r>
+          </w:p>
+        </w:tc>
+        <w:tc>
+          <w:tcPr>
+            <w:tcW w:type="dxa" w:w="2880"/>
+          </w:tcPr>
+          <w:p>
+            <w:r>
+              <w:t>Detail + benefits by category + remove/primary</w:t>
+            </w:r>
+          </w:p>
+        </w:tc>
+        <w:tc>
+          <w:tcPr>
+            <w:tcW w:type="dxa" w:w="2880"/>
+          </w:tcPr>
+          <w:p>
+            <w:r>
+              <w:t>✅</w:t>
+            </w:r>
+          </w:p>
+        </w:tc>
+      </w:tr>
+      <w:tr>
+        <w:tc>
+          <w:tcPr>
+            <w:tcW w:type="dxa" w:w="2880"/>
+          </w:tcPr>
+          <w:p>
+            <w:r>
+              <w:t>/recommender</w:t>
+            </w:r>
+          </w:p>
+        </w:tc>
+        <w:tc>
+          <w:tcPr>
+            <w:tcW w:type="dxa" w:w="2880"/>
+          </w:tcPr>
+          <w:p>
+            <w:r>
+              <w:t>Recommender by category</w:t>
+            </w:r>
+          </w:p>
+        </w:tc>
+        <w:tc>
+          <w:tcPr>
+            <w:tcW w:type="dxa" w:w="2880"/>
+          </w:tcPr>
+          <w:p>
+            <w:r>
+              <w:t>✅</w:t>
+            </w:r>
+          </w:p>
+        </w:tc>
+      </w:tr>
+      <w:tr>
+        <w:tc>
+          <w:tcPr>
+            <w:tcW w:type="dxa" w:w="2880"/>
+          </w:tcPr>
+          <w:p>
+            <w:r>
+              <w:t>/offers</w:t>
+            </w:r>
+          </w:p>
+        </w:tc>
+        <w:tc>
+          <w:tcPr>
+            <w:tcW w:type="dxa" w:w="2880"/>
+          </w:tcPr>
+          <w:p>
+            <w:r>
+              <w:t>Offers feed with filters</w:t>
+            </w:r>
+          </w:p>
+        </w:tc>
+        <w:tc>
+          <w:tcPr>
+            <w:tcW w:type="dxa" w:w="2880"/>
+          </w:tcPr>
+          <w:p>
+            <w:r>
+              <w:t>🟡 (missing detail + outbound link)</w:t>
+            </w:r>
+          </w:p>
+        </w:tc>
+      </w:tr>
+      <w:tr>
+        <w:tc>
+          <w:tcPr>
+            <w:tcW w:type="dxa" w:w="2880"/>
+          </w:tcPr>
+          <w:p>
+            <w:r>
+              <w:t>/profile</w:t>
+            </w:r>
+          </w:p>
+        </w:tc>
+        <w:tc>
+          <w:tcPr>
+            <w:tcW w:type="dxa" w:w="2880"/>
+          </w:tcPr>
+          <w:p>
+            <w:r>
+              <w:t>Profile + privacy + sign out</w:t>
+            </w:r>
+          </w:p>
+        </w:tc>
+        <w:tc>
+          <w:tcPr>
+            <w:tcW w:type="dxa" w:w="2880"/>
+          </w:tcPr>
+          <w:p>
+            <w:r>
+              <w:t>✅</w:t>
+            </w:r>
+          </w:p>
+        </w:tc>
+      </w:tr>
+      <w:tr>
+        <w:tc>
+          <w:tcPr>
+            <w:tcW w:type="dxa" w:w="2880"/>
+          </w:tcPr>
+          <w:p>
+            <w:r>
+              <w:t>/destacados</w:t>
+            </w:r>
+          </w:p>
+        </w:tc>
+        <w:tc>
+          <w:tcPr>
+            <w:tcW w:type="dxa" w:w="2880"/>
+          </w:tcPr>
+          <w:p>
+            <w:r>
+              <w:t>"Best in market"</w:t>
+            </w:r>
+          </w:p>
+        </w:tc>
+        <w:tc>
+          <w:tcPr>
+            <w:tcW w:type="dxa" w:w="2880"/>
+          </w:tcPr>
+          <w:p>
+            <w:r>
+              <w:t>🔲 (to be designed)</w:t>
+            </w:r>
+          </w:p>
+        </w:tc>
+      </w:tr>
+    </w:tbl>
+    <w:p>
+      <w:pPr>
+        <w:pStyle w:val="Heading2"/>
+      </w:pPr>
+      <w:r>
+        <w:t>10.6 Categories (11, defined in src/types/database.ts)</w:t>
+      </w:r>
+    </w:p>
+    <w:p>
+      <w:r>
+        <w:t>General 🔧 · Cashback 💰 · Points/Miles 🏆 · Travel ✈️ · Restaurants 🍽️ · Entertainment 🎬 · Supermarkets 🛒 · Fuel ⛽ · Streaming 📺 · Fashion 👗 · Insurance 🛡️.</w:t>
+      </w:r>
+    </w:p>
+    <w:p>
+      <w:pPr>
+        <w:pStyle w:val="Heading2"/>
+      </w:pPr>
+      <w:r>
+        <w:t>10.7 Tone of voice</w:t>
+      </w:r>
+    </w:p>
+    <w:p>
+      <w:r>
+        <w:t>Colombian Spanish, warm and clear, second person ("tus tarjetas", "elige una categoría"). Short messages; empty states always with a CTA. Correct accentuation required.</w:t>
       </w:r>
     </w:p>
     <w:sectPr>

</xml_diff>